<commit_message>
docs: cambiar diagrama de bloques a orientacion vertical para mejor ajuste en A4
</commit_message>
<xml_diff>
--- a/docs/DOCUMENTO_TECNICO_OPTOELECTRONICA.docx
+++ b/docs/DOCUMENTO_TECNICO_OPTOELECTRONICA.docx
@@ -2095,7 +2095,7 @@
       <w:r>
         <w:drawing>
           <wp:inline xmlns:a="http://schemas.openxmlformats.org/drawingml/2006/main" xmlns:pic="http://schemas.openxmlformats.org/drawingml/2006/picture">
-            <wp:extent cx="5303520" cy="1064047"/>
+            <wp:extent cx="5303520" cy="5836386"/>
             <wp:docPr id="9" name="Picture 9"/>
             <wp:cNvGraphicFramePr>
               <a:graphicFrameLocks noChangeAspect="1"/>
@@ -2116,7 +2116,7 @@
                   <pic:spPr>
                     <a:xfrm>
                       <a:off x="0" y="0"/>
-                      <a:ext cx="5303520" cy="1064047"/>
+                      <a:ext cx="5303520" cy="5836386"/>
                     </a:xfrm>
                     <a:prstGeom prst="rect"/>
                   </pic:spPr>

</xml_diff>